<commit_message>
Restore byte-exact Biogerontology submitted manuscript archive
</commit_message>
<xml_diff>
--- a/submission/biogerontology/archive/PhysioRisk_Biogerontology_Manuscript_submitted_snapp.docx
+++ b/submission/biogerontology/archive/PhysioRisk_Biogerontology_Manuscript_submitted_snapp.docx
@@ -1,6 +1,6 @@
 
 <file path=word/document.xml><?xml version="1.0" encoding="utf-8"?>
-<w:document xmlns:o="urn:schemas-microsoft-com:office:office" xmlns:r="http://schemas.openxmlformats.org/officeDocument/2006/relationships" xmlns:v="urn:schemas-microsoft-com:vml" xmlns:w="http://schemas.openxmlformats.org/wordprocessingml/2006/main" xmlns:w10="urn:schemas-microsoft-com:office:word" xmlns:wp="http://schemas.openxmlformats.org/drawingml/2006/wordprocessingDrawing" xmlns:pic="http://schemas.openxmlformats.org/drawingml/2006/picture" xmlns:wps="http://schemas.microsoft.com/office/word/2010/wordprocessingShape" xmlns:wpg="http://schemas.microsoft.com/office/word/2010/wordprocessingGroup" xmlns:mc="http://schemas.openxmlformats.org/markup-compatibility/2006" xmlns:wp14="http://schemas.microsoft.com/office/word/2010/wordprocessingDrawing" xmlns:w14="http://schemas.microsoft.com/office/word/2010/wordml" xmlns:w15="http://schemas.microsoft.com/office/word/2012/wordml" mc:Ignorable="w14 wp14 w15">
+<w:document xmlns:ns1="http://schemas.openxmlformats.org/markup-compatibility/2006" xmlns:ns2="http://schemas.openxmlformats.org/drawingml/2006/wordprocessingDrawing" xmlns:ns3="http://schemas.openxmlformats.org/drawingml/2006/main" xmlns:ns4="http://schemas.openxmlformats.org/drawingml/2006/picture" xmlns:ns5="http://schemas.openxmlformats.org/officeDocument/2006/relationships" xmlns:w="http://schemas.openxmlformats.org/wordprocessingml/2006/main" ns1:Ignorable="w14 wp14 w15">
   <w:body>
     <w:p>
       <w:pPr>
@@ -4124,42 +4124,42 @@
       <w:r>
         <w:rPr/>
         <w:drawing>
-          <wp:inline distT="0" distB="0" distL="0" distR="0">
-            <wp:extent cx="5943600" cy="3698240"/>
-            <wp:effectExtent l="0" t="0" r="0" b="0"/>
-            <wp:docPr id="1" name="Picture 1"/>
-            <wp:cNvGraphicFramePr>
-              <a:graphicFrameLocks xmlns:a="http://schemas.openxmlformats.org/drawingml/2006/main" noChangeAspect="1"/>
-            </wp:cNvGraphicFramePr>
-            <a:graphic xmlns:a="http://schemas.openxmlformats.org/drawingml/2006/main">
-              <a:graphicData uri="http://schemas.openxmlformats.org/drawingml/2006/picture">
-                <pic:pic xmlns:pic="http://schemas.openxmlformats.org/drawingml/2006/picture">
-                  <pic:nvPicPr>
-                    <pic:cNvPr id="1" name="Picture 1"/>
-                    <pic:cNvPicPr>
-                      <a:picLocks noChangeAspect="1" noChangeArrowheads="1"/>
-                    </pic:cNvPicPr>
-                  </pic:nvPicPr>
-                  <pic:blipFill>
-                    <a:blip r:embed="rId2"/>
-                    <a:stretch>
-                      <a:fillRect/>
-                    </a:stretch>
-                  </pic:blipFill>
-                  <pic:spPr bwMode="auto">
-                    <a:xfrm>
-                      <a:off x="0" y="0"/>
-                      <a:ext cx="5943600" cy="3698240"/>
-                    </a:xfrm>
-                    <a:prstGeom prst="rect">
-                      <a:avLst/>
-                    </a:prstGeom>
-                    <a:noFill/>
-                  </pic:spPr>
-                </pic:pic>
-              </a:graphicData>
-            </a:graphic>
-          </wp:inline>
+          <ns2:inline distT="0" distB="0" distL="0" distR="0">
+            <ns2:extent cx="5943600" cy="3698240"/>
+            <ns2:effectExtent l="0" t="0" r="0" b="0"/>
+            <ns2:docPr id="1" name="Picture 1"/>
+            <ns2:cNvGraphicFramePr>
+              <ns3:graphicFrameLocks noChangeAspect="1"/>
+            </ns2:cNvGraphicFramePr>
+            <ns3:graphic>
+              <ns3:graphicData uri="http://schemas.openxmlformats.org/drawingml/2006/picture">
+                <ns4:pic>
+                  <ns4:nvPicPr>
+                    <ns4:cNvPr id="1" name="Picture 1"/>
+                    <ns4:cNvPicPr>
+                      <ns3:picLocks noChangeAspect="1" noChangeArrowheads="1"/>
+                    </ns4:cNvPicPr>
+                  </ns4:nvPicPr>
+                  <ns4:blipFill>
+                    <ns3:blip ns5:embed="rId2"/>
+                    <ns3:stretch>
+                      <ns3:fillRect/>
+                    </ns3:stretch>
+                  </ns4:blipFill>
+                  <ns4:spPr bwMode="auto">
+                    <ns3:xfrm>
+                      <ns3:off x="0" y="0"/>
+                      <ns3:ext cx="5943600" cy="3698240"/>
+                    </ns3:xfrm>
+                    <ns3:prstGeom prst="rect">
+                      <ns3:avLst/>
+                    </ns3:prstGeom>
+                    <ns3:noFill/>
+                  </ns4:spPr>
+                </ns4:pic>
+              </ns3:graphicData>
+            </ns3:graphic>
+          </ns2:inline>
         </w:drawing>
       </w:r>
     </w:p>
@@ -4186,42 +4186,42 @@
       <w:r>
         <w:rPr/>
         <w:drawing>
-          <wp:inline distT="0" distB="0" distL="0" distR="0">
-            <wp:extent cx="5943600" cy="2661920"/>
-            <wp:effectExtent l="0" t="0" r="0" b="0"/>
-            <wp:docPr id="2" name="Picture 2"/>
-            <wp:cNvGraphicFramePr>
-              <a:graphicFrameLocks xmlns:a="http://schemas.openxmlformats.org/drawingml/2006/main" noChangeAspect="1"/>
-            </wp:cNvGraphicFramePr>
-            <a:graphic xmlns:a="http://schemas.openxmlformats.org/drawingml/2006/main">
-              <a:graphicData uri="http://schemas.openxmlformats.org/drawingml/2006/picture">
-                <pic:pic xmlns:pic="http://schemas.openxmlformats.org/drawingml/2006/picture">
-                  <pic:nvPicPr>
-                    <pic:cNvPr id="2" name="Picture 2"/>
-                    <pic:cNvPicPr>
-                      <a:picLocks noChangeAspect="1" noChangeArrowheads="1"/>
-                    </pic:cNvPicPr>
-                  </pic:nvPicPr>
-                  <pic:blipFill>
-                    <a:blip r:embed="rId3"/>
-                    <a:stretch>
-                      <a:fillRect/>
-                    </a:stretch>
-                  </pic:blipFill>
-                  <pic:spPr bwMode="auto">
-                    <a:xfrm>
-                      <a:off x="0" y="0"/>
-                      <a:ext cx="5943600" cy="2661920"/>
-                    </a:xfrm>
-                    <a:prstGeom prst="rect">
-                      <a:avLst/>
-                    </a:prstGeom>
-                    <a:noFill/>
-                  </pic:spPr>
-                </pic:pic>
-              </a:graphicData>
-            </a:graphic>
-          </wp:inline>
+          <ns2:inline distT="0" distB="0" distL="0" distR="0">
+            <ns2:extent cx="5943600" cy="2661920"/>
+            <ns2:effectExtent l="0" t="0" r="0" b="0"/>
+            <ns2:docPr id="2" name="Picture 2"/>
+            <ns2:cNvGraphicFramePr>
+              <ns3:graphicFrameLocks noChangeAspect="1"/>
+            </ns2:cNvGraphicFramePr>
+            <ns3:graphic>
+              <ns3:graphicData uri="http://schemas.openxmlformats.org/drawingml/2006/picture">
+                <ns4:pic>
+                  <ns4:nvPicPr>
+                    <ns4:cNvPr id="2" name="Picture 2"/>
+                    <ns4:cNvPicPr>
+                      <ns3:picLocks noChangeAspect="1" noChangeArrowheads="1"/>
+                    </ns4:cNvPicPr>
+                  </ns4:nvPicPr>
+                  <ns4:blipFill>
+                    <ns3:blip ns5:embed="rId3"/>
+                    <ns3:stretch>
+                      <ns3:fillRect/>
+                    </ns3:stretch>
+                  </ns4:blipFill>
+                  <ns4:spPr bwMode="auto">
+                    <ns3:xfrm>
+                      <ns3:off x="0" y="0"/>
+                      <ns3:ext cx="5943600" cy="2661920"/>
+                    </ns3:xfrm>
+                    <ns3:prstGeom prst="rect">
+                      <ns3:avLst/>
+                    </ns3:prstGeom>
+                    <ns3:noFill/>
+                  </ns4:spPr>
+                </ns4:pic>
+              </ns3:graphicData>
+            </ns3:graphic>
+          </ns2:inline>
         </w:drawing>
       </w:r>
     </w:p>
@@ -4599,15 +4599,15 @@
       </w:r>
     </w:p>
     <w:sectPr>
-      <w:footerReference w:type="even" r:id="rId4"/>
-      <w:footerReference w:type="default" r:id="rId5"/>
-      <w:footerReference w:type="first" r:id="rId6"/>
+      <w:footerReference w:type="even" ns5:id="rId4"/>
+      <w:footerReference w:type="default" ns5:id="rId5"/>
+      <w:footerReference w:type="first" ns5:id="rId4"/>
+      <w:titlePg/>
       <w:type w:val="nextPage"/>
       <w:pgSz w:w="12240" w:h="15840"/>
       <w:pgMar w:left="1123" w:right="1123" w:gutter="0" w:header="0" w:top="1080" w:footer="720" w:bottom="1008"/>
       <w:pgNumType w:fmt="decimal"/>
       <w:formProt w:val="false"/>
-      <w:titlePg/>
       <w:textDirection w:val="lrTb"/>
       <w:docGrid w:type="default" w:linePitch="360" w:charSpace="0"/>
     </w:sectPr>
@@ -4651,7 +4651,7 @@
     </w:r>
     <w:r>
       <w:rPr/>
-      <w:t>13</w:t>
+      <w:t>12</w:t>
     </w:r>
     <w:r>
       <w:rPr/>
@@ -4666,10 +4666,28 @@
   <w:p>
     <w:pPr>
       <w:pStyle w:val="Footer"/>
+      <w:jc w:val="center"/>
       <w:rPr/>
     </w:pPr>
     <w:r>
       <w:rPr/>
+      <w:fldChar w:fldCharType="begin"/>
+    </w:r>
+    <w:r>
+      <w:rPr/>
+      <w:instrText xml:space="preserve"> PAGE </w:instrText>
+    </w:r>
+    <w:r>
+      <w:rPr/>
+      <w:fldChar w:fldCharType="separate"/>
+    </w:r>
+    <w:r>
+      <w:rPr/>
+      <w:t>12</w:t>
+    </w:r>
+    <w:r>
+      <w:rPr/>
+      <w:fldChar w:fldCharType="end"/>
     </w:r>
   </w:p>
 </w:ftr>

</xml_diff>